<commit_message>
Documentation and Analysis modal VPS
</commit_message>
<xml_diff>
--- a/src/content/legal/Terms-of-service-7.docx
+++ b/src/content/legal/Terms-of-service-7.docx
@@ -1469,38 +1469,185 @@
     </w:p>
     <w:p>
       <w:pPr>
-        <w:spacing w:after="240" w:before="240" w:lineRule="auto"/>
-        <w:rPr>
-          <w:rFonts w:ascii="Lexend ExtraLight" w:cs="Lexend ExtraLight" w:eastAsia="Lexend ExtraLight" w:hAnsi="Lexend ExtraLight"/>
-          <w:sz w:val="18"/>
-          <w:szCs w:val="18"/>
-        </w:rPr>
-      </w:pPr>
-      <w:r>
-        <w:rPr>
-          <w:rFonts w:ascii="Lexend ExtraLight" w:cs="Lexend ExtraLight" w:eastAsia="Lexend ExtraLight" w:hAnsi="Lexend ExtraLight"/>
-          <w:sz w:val="18"/>
-          <w:szCs w:val="18"/>
-          <w:rtl w:val="0"/>
-        </w:rPr>
-        <w:t xml:space="preserve">use PepPro to prescribe, diagnose, treat, manage, or monitor patients;</w:t>
+        <w:numPr>
+          <w:ilvl w:val="0"/>
+          <w:numId w:val="1"/>
+        </w:numPr>
+        <w:spacing w:after="0" w:afterAutospacing="0" w:before="240" w:lineRule="auto"/>
+        <w:ind w:left="720" w:hanging="360"/>
+        <w:rPr>
+          <w:rFonts w:ascii="Lexend ExtraLight" w:cs="Lexend ExtraLight" w:eastAsia="Lexend ExtraLight" w:hAnsi="Lexend ExtraLight"/>
+          <w:sz w:val="18"/>
+          <w:szCs w:val="18"/>
+          <w:u w:val="none"/>
+        </w:rPr>
+      </w:pPr>
+      <w:r>
+        <w:rPr>
+          <w:rFonts w:ascii="Lexend ExtraLight" w:cs="Lexend ExtraLight" w:eastAsia="Lexend ExtraLight" w:hAnsi="Lexend ExtraLight"/>
+          <w:sz w:val="18"/>
+          <w:szCs w:val="18"/>
+          <w:rtl w:val="0"/>
+        </w:rPr>
+        <w:t xml:space="preserve">use PepPro to prescribe, diagnose, treat, manage, or monitor patients; or</w:t>
         <w:br w:type="textWrapping"/>
-        <w:t xml:space="preserve">represent PepPro products as safe or effective for human or animal use;</w:t>
-        <w:br w:type="textWrapping"/>
-        <w:t xml:space="preserve">upload PHI or sensitive health information without proper authorization and a separate written agreement where required;</w:t>
-        <w:br w:type="textWrapping"/>
-        <w:t xml:space="preserve">misrepresent identity, credentials, licensure, affiliation, research status, or authority;</w:t>
-        <w:br w:type="textWrapping"/>
-        <w:t xml:space="preserve">use Delegate Links in a misleading, promotional, outcome-based, or clinically suggestive manner;</w:t>
-        <w:br w:type="textWrapping"/>
+        <w:t xml:space="preserve">represent PepPro products as safe or effective for human or animal use; or</w:t>
+      </w:r>
+    </w:p>
+    <w:p>
+      <w:pPr>
+        <w:numPr>
+          <w:ilvl w:val="0"/>
+          <w:numId w:val="1"/>
+        </w:numPr>
+        <w:spacing w:after="0" w:afterAutospacing="0" w:before="0" w:beforeAutospacing="0" w:lineRule="auto"/>
+        <w:ind w:left="720" w:hanging="360"/>
+        <w:rPr>
+          <w:rFonts w:ascii="Lexend ExtraLight" w:cs="Lexend ExtraLight" w:eastAsia="Lexend ExtraLight" w:hAnsi="Lexend ExtraLight"/>
+          <w:sz w:val="18"/>
+          <w:szCs w:val="18"/>
+          <w:u w:val="none"/>
+        </w:rPr>
+      </w:pPr>
+      <w:r>
+        <w:rPr>
+          <w:rFonts w:ascii="Lexend ExtraLight" w:cs="Lexend ExtraLight" w:eastAsia="Lexend ExtraLight" w:hAnsi="Lexend ExtraLight"/>
+          <w:sz w:val="18"/>
+          <w:szCs w:val="18"/>
+          <w:rtl w:val="0"/>
+        </w:rPr>
+        <w:t xml:space="preserve">upload PHI or sensitive health information without proper authorization and a separate written agreement where required; or</w:t>
+      </w:r>
+    </w:p>
+    <w:p>
+      <w:pPr>
+        <w:numPr>
+          <w:ilvl w:val="0"/>
+          <w:numId w:val="1"/>
+        </w:numPr>
+        <w:spacing w:after="0" w:afterAutospacing="0" w:before="0" w:beforeAutospacing="0" w:lineRule="auto"/>
+        <w:ind w:left="720" w:hanging="360"/>
+        <w:rPr>
+          <w:rFonts w:ascii="Lexend ExtraLight" w:cs="Lexend ExtraLight" w:eastAsia="Lexend ExtraLight" w:hAnsi="Lexend ExtraLight"/>
+          <w:sz w:val="18"/>
+          <w:szCs w:val="18"/>
+          <w:u w:val="none"/>
+        </w:rPr>
+      </w:pPr>
+      <w:r>
+        <w:rPr>
+          <w:rFonts w:ascii="Lexend ExtraLight" w:cs="Lexend ExtraLight" w:eastAsia="Lexend ExtraLight" w:hAnsi="Lexend ExtraLight"/>
+          <w:sz w:val="18"/>
+          <w:szCs w:val="18"/>
+          <w:rtl w:val="0"/>
+        </w:rPr>
+        <w:t xml:space="preserve">misrepresent identity, credentials, licensure, affiliation, research status, or authority; or</w:t>
+      </w:r>
+    </w:p>
+    <w:p>
+      <w:pPr>
+        <w:numPr>
+          <w:ilvl w:val="0"/>
+          <w:numId w:val="1"/>
+        </w:numPr>
+        <w:spacing w:after="0" w:afterAutospacing="0" w:before="0" w:beforeAutospacing="0" w:lineRule="auto"/>
+        <w:ind w:left="720" w:hanging="360"/>
+        <w:rPr>
+          <w:rFonts w:ascii="Lexend ExtraLight" w:cs="Lexend ExtraLight" w:eastAsia="Lexend ExtraLight" w:hAnsi="Lexend ExtraLight"/>
+          <w:sz w:val="18"/>
+          <w:szCs w:val="18"/>
+          <w:u w:val="none"/>
+        </w:rPr>
+      </w:pPr>
+      <w:r>
+        <w:rPr>
+          <w:rFonts w:ascii="Lexend ExtraLight" w:cs="Lexend ExtraLight" w:eastAsia="Lexend ExtraLight" w:hAnsi="Lexend ExtraLight"/>
+          <w:sz w:val="18"/>
+          <w:szCs w:val="18"/>
+          <w:rtl w:val="0"/>
+        </w:rPr>
+        <w:t xml:space="preserve">use Delegate Links in a misleading, promotional, outcome-based, or clinically suggestive manner; or</w:t>
+      </w:r>
+    </w:p>
+    <w:p>
+      <w:pPr>
+        <w:numPr>
+          <w:ilvl w:val="0"/>
+          <w:numId w:val="1"/>
+        </w:numPr>
+        <w:spacing w:after="0" w:afterAutospacing="0" w:before="0" w:beforeAutospacing="0" w:lineRule="auto"/>
+        <w:ind w:left="720" w:hanging="360"/>
+        <w:rPr>
+          <w:rFonts w:ascii="Lexend ExtraLight" w:cs="Lexend ExtraLight" w:eastAsia="Lexend ExtraLight" w:hAnsi="Lexend ExtraLight"/>
+          <w:sz w:val="18"/>
+          <w:szCs w:val="18"/>
+          <w:u w:val="none"/>
+        </w:rPr>
+      </w:pPr>
+      <w:r>
+        <w:rPr>
+          <w:rFonts w:ascii="Lexend ExtraLight" w:cs="Lexend ExtraLight" w:eastAsia="Lexend ExtraLight" w:hAnsi="Lexend ExtraLight"/>
+          <w:sz w:val="18"/>
+          <w:szCs w:val="18"/>
+          <w:rtl w:val="0"/>
+        </w:rPr>
         <w:t xml:space="preserve">circumvent quantity limits, geographic restrictions, verification controls, or account restrictions; or</w:t>
-        <w:br w:type="textWrapping"/>
-        <w:t xml:space="preserve">use the platform in any manner that creates regulatory risk, consumer confusion, fraud risk, or reputational harm to PepPro.</w:t>
-      </w:r>
-    </w:p>
-    <w:p>
-      <w:pPr>
-        <w:spacing w:after="240" w:before="240" w:lineRule="auto"/>
+      </w:r>
+    </w:p>
+    <w:p>
+      <w:pPr>
+        <w:numPr>
+          <w:ilvl w:val="0"/>
+          <w:numId w:val="1"/>
+        </w:numPr>
+        <w:spacing w:after="0" w:afterAutospacing="0" w:before="0" w:beforeAutospacing="0" w:lineRule="auto"/>
+        <w:ind w:left="720" w:hanging="360"/>
+        <w:rPr>
+          <w:rFonts w:ascii="Lexend ExtraLight" w:cs="Lexend ExtraLight" w:eastAsia="Lexend ExtraLight" w:hAnsi="Lexend ExtraLight"/>
+          <w:sz w:val="18"/>
+          <w:szCs w:val="18"/>
+          <w:u w:val="none"/>
+        </w:rPr>
+      </w:pPr>
+      <w:r>
+        <w:rPr>
+          <w:rFonts w:ascii="Lexend ExtraLight" w:cs="Lexend ExtraLight" w:eastAsia="Lexend ExtraLight" w:hAnsi="Lexend ExtraLight"/>
+          <w:sz w:val="18"/>
+          <w:szCs w:val="18"/>
+          <w:rtl w:val="0"/>
+        </w:rPr>
+        <w:t xml:space="preserve">use the platform in any manner that creates regulatory risk, consumer confusion, fraud risk, or reputational harm to PepPro; or</w:t>
+      </w:r>
+    </w:p>
+    <w:p>
+      <w:pPr>
+        <w:numPr>
+          <w:ilvl w:val="0"/>
+          <w:numId w:val="1"/>
+        </w:numPr>
+        <w:spacing w:after="240" w:before="0" w:beforeAutospacing="0" w:lineRule="auto"/>
+        <w:ind w:left="720" w:hanging="360"/>
+        <w:rPr>
+          <w:rFonts w:ascii="Lexend ExtraLight" w:cs="Lexend ExtraLight" w:eastAsia="Lexend ExtraLight" w:hAnsi="Lexend ExtraLight"/>
+          <w:sz w:val="18"/>
+          <w:szCs w:val="18"/>
+          <w:u w:val="none"/>
+        </w:rPr>
+      </w:pPr>
+      <w:r>
+        <w:rPr>
+          <w:rFonts w:ascii="Lexend ExtraLight" w:cs="Lexend ExtraLight" w:eastAsia="Lexend ExtraLight" w:hAnsi="Lexend ExtraLight"/>
+          <w:sz w:val="18"/>
+          <w:szCs w:val="18"/>
+          <w:rtl w:val="0"/>
+        </w:rPr>
+        <w:t xml:space="preserve">disclose, share, distribute, reproduce, or make available any PepPro materials, documentation, data, research content, platform outputs, or network resources designated as confidential or non-public, without PepPro’s prior written consent, including any materials obtained through the PepPro research network or platform;</w:t>
+      </w:r>
+    </w:p>
+    <w:p>
+      <w:pPr>
+        <w:spacing w:after="240" w:before="240" w:lineRule="auto"/>
+        <w:ind w:left="0" w:firstLine="0"/>
         <w:rPr>
           <w:rFonts w:ascii="Lexend ExtraLight" w:cs="Lexend ExtraLight" w:eastAsia="Lexend ExtraLight" w:hAnsi="Lexend ExtraLight"/>
           <w:sz w:val="18"/>
@@ -1815,7 +1962,121 @@
 </file>
 
 <file path=word/numbering.xml><?xml version="1.0" encoding="utf-8"?>
-<w:numbering xmlns:mc="http://schemas.openxmlformats.org/markup-compatibility/2006" xmlns:o="urn:schemas-microsoft-com:office:office" xmlns:r="http://schemas.openxmlformats.org/officeDocument/2006/relationships" xmlns:m="http://schemas.openxmlformats.org/officeDocument/2006/math" xmlns:v="urn:schemas-microsoft-com:vml" xmlns:wp="http://schemas.openxmlformats.org/drawingml/2006/wordprocessingDrawing" xmlns:w10="urn:schemas-microsoft-com:office:word" xmlns:w="http://schemas.openxmlformats.org/wordprocessingml/2006/main" xmlns:wne="http://schemas.microsoft.com/office/word/2006/wordml" xmlns:sl="http://schemas.openxmlformats.org/schemaLibrary/2006/main" xmlns:a="http://schemas.openxmlformats.org/drawingml/2006/main" xmlns:pic="http://schemas.openxmlformats.org/drawingml/2006/picture" xmlns:c="http://schemas.openxmlformats.org/drawingml/2006/chart" xmlns:lc="http://schemas.openxmlformats.org/drawingml/2006/lockedCanvas" xmlns:dgm="http://schemas.openxmlformats.org/drawingml/2006/diagram" xmlns:wps="http://schemas.microsoft.com/office/word/2010/wordprocessingShape" xmlns:wpg="http://schemas.microsoft.com/office/word/2010/wordprocessingGroup" xmlns:w14="http://schemas.microsoft.com/office/word/2010/wordml" xmlns:w15="http://schemas.microsoft.com/office/word/2012/wordml" xmlns:w16="http://schemas.microsoft.com/office/word/2018/wordml" xmlns:w16cex="http://schemas.microsoft.com/office/word/2018/wordml/cex" xmlns:w16cid="http://schemas.microsoft.com/office/word/2016/wordml/cid" xmlns="http://schemas.microsoft.com/office/tasks/2019/documenttasks" xmlns:cr="http://schemas.microsoft.com/office/comments/2020/reactions"/>
+<w:numbering xmlns:mc="http://schemas.openxmlformats.org/markup-compatibility/2006" xmlns:o="urn:schemas-microsoft-com:office:office" xmlns:r="http://schemas.openxmlformats.org/officeDocument/2006/relationships" xmlns:m="http://schemas.openxmlformats.org/officeDocument/2006/math" xmlns:v="urn:schemas-microsoft-com:vml" xmlns:wp="http://schemas.openxmlformats.org/drawingml/2006/wordprocessingDrawing" xmlns:w10="urn:schemas-microsoft-com:office:word" xmlns:w="http://schemas.openxmlformats.org/wordprocessingml/2006/main" xmlns:wne="http://schemas.microsoft.com/office/word/2006/wordml" xmlns:sl="http://schemas.openxmlformats.org/schemaLibrary/2006/main" xmlns:a="http://schemas.openxmlformats.org/drawingml/2006/main" xmlns:pic="http://schemas.openxmlformats.org/drawingml/2006/picture" xmlns:c="http://schemas.openxmlformats.org/drawingml/2006/chart" xmlns:lc="http://schemas.openxmlformats.org/drawingml/2006/lockedCanvas" xmlns:dgm="http://schemas.openxmlformats.org/drawingml/2006/diagram" xmlns:wps="http://schemas.microsoft.com/office/word/2010/wordprocessingShape" xmlns:wpg="http://schemas.microsoft.com/office/word/2010/wordprocessingGroup" xmlns:w14="http://schemas.microsoft.com/office/word/2010/wordml" xmlns:w15="http://schemas.microsoft.com/office/word/2012/wordml" xmlns:w16="http://schemas.microsoft.com/office/word/2018/wordml" xmlns:w16cex="http://schemas.microsoft.com/office/word/2018/wordml/cex" xmlns:w16cid="http://schemas.microsoft.com/office/word/2016/wordml/cid" xmlns="http://schemas.microsoft.com/office/tasks/2019/documenttasks" xmlns:cr="http://schemas.microsoft.com/office/comments/2020/reactions">
+  <w:abstractNum w:abstractNumId="1">
+    <w:lvl w:ilvl="0">
+      <w:start w:val="1"/>
+      <w:numFmt w:val="bullet"/>
+      <w:lvlText w:val="-"/>
+      <w:lvlJc w:val="left"/>
+      <w:pPr>
+        <w:ind w:left="720" w:hanging="360"/>
+      </w:pPr>
+      <w:rPr>
+        <w:u w:val="none"/>
+      </w:rPr>
+    </w:lvl>
+    <w:lvl w:ilvl="1">
+      <w:start w:val="1"/>
+      <w:numFmt w:val="bullet"/>
+      <w:lvlText w:val="-"/>
+      <w:lvlJc w:val="left"/>
+      <w:pPr>
+        <w:ind w:left="1440" w:hanging="360"/>
+      </w:pPr>
+      <w:rPr>
+        <w:u w:val="none"/>
+      </w:rPr>
+    </w:lvl>
+    <w:lvl w:ilvl="2">
+      <w:start w:val="1"/>
+      <w:numFmt w:val="bullet"/>
+      <w:lvlText w:val="-"/>
+      <w:lvlJc w:val="left"/>
+      <w:pPr>
+        <w:ind w:left="2160" w:hanging="360"/>
+      </w:pPr>
+      <w:rPr>
+        <w:u w:val="none"/>
+      </w:rPr>
+    </w:lvl>
+    <w:lvl w:ilvl="3">
+      <w:start w:val="1"/>
+      <w:numFmt w:val="bullet"/>
+      <w:lvlText w:val="-"/>
+      <w:lvlJc w:val="left"/>
+      <w:pPr>
+        <w:ind w:left="2880" w:hanging="360"/>
+      </w:pPr>
+      <w:rPr>
+        <w:u w:val="none"/>
+      </w:rPr>
+    </w:lvl>
+    <w:lvl w:ilvl="4">
+      <w:start w:val="1"/>
+      <w:numFmt w:val="bullet"/>
+      <w:lvlText w:val="-"/>
+      <w:lvlJc w:val="left"/>
+      <w:pPr>
+        <w:ind w:left="3600" w:hanging="360"/>
+      </w:pPr>
+      <w:rPr>
+        <w:u w:val="none"/>
+      </w:rPr>
+    </w:lvl>
+    <w:lvl w:ilvl="5">
+      <w:start w:val="1"/>
+      <w:numFmt w:val="bullet"/>
+      <w:lvlText w:val="-"/>
+      <w:lvlJc w:val="left"/>
+      <w:pPr>
+        <w:ind w:left="4320" w:hanging="360"/>
+      </w:pPr>
+      <w:rPr>
+        <w:u w:val="none"/>
+      </w:rPr>
+    </w:lvl>
+    <w:lvl w:ilvl="6">
+      <w:start w:val="1"/>
+      <w:numFmt w:val="bullet"/>
+      <w:lvlText w:val="-"/>
+      <w:lvlJc w:val="left"/>
+      <w:pPr>
+        <w:ind w:left="5040" w:hanging="360"/>
+      </w:pPr>
+      <w:rPr>
+        <w:u w:val="none"/>
+      </w:rPr>
+    </w:lvl>
+    <w:lvl w:ilvl="7">
+      <w:start w:val="1"/>
+      <w:numFmt w:val="bullet"/>
+      <w:lvlText w:val="-"/>
+      <w:lvlJc w:val="left"/>
+      <w:pPr>
+        <w:ind w:left="5760" w:hanging="360"/>
+      </w:pPr>
+      <w:rPr>
+        <w:u w:val="none"/>
+      </w:rPr>
+    </w:lvl>
+    <w:lvl w:ilvl="8">
+      <w:start w:val="1"/>
+      <w:numFmt w:val="bullet"/>
+      <w:lvlText w:val="-"/>
+      <w:lvlJc w:val="left"/>
+      <w:pPr>
+        <w:ind w:left="6480" w:hanging="360"/>
+      </w:pPr>
+      <w:rPr>
+        <w:u w:val="none"/>
+      </w:rPr>
+    </w:lvl>
+  </w:abstractNum>
+  <w:num w:numId="1">
+    <w:abstractNumId w:val="1"/>
+  </w:num>
+</w:numbering>
 </file>
 
 <file path=word/styles.xml><?xml version="1.0" encoding="utf-8"?>

</xml_diff>